<commit_message>
fix(veilles): sept sources nommées sans adresse (passes A2/A4) reçoivent leur page
rbpp 06/04 (deux pages HAS, note de cadrage re-datée 6/12 mai 2025), 26/04 (rubrique
Ressources DSM-5-TR / CIM-11), 22/05, 22/06 ; SERAFIN 09/09 ; imac 02/08 ; veille-essms
20/05. non_regression.sh : 7 → 0, aucun autre verdict changé, référence acceptée
(0 bloquant sur 221 aux passes A/A2/A3/A4).

Co-Authored-By: Claude Opus 5 <noreply@anthropic.com>
</commit_message>
<xml_diff>
--- a/sources/veille/2026-04-06_veille_rbpp_projet-personnalise.docx
+++ b/sources/veille/2026-04-06_veille_rbpp_projet-personnalise.docx
@@ -3447,7 +3447,101 @@
           <w:sz w:val="18"/>
           <w:szCs w:val="18"/>
         </w:rPr>
-        <w:t xml:space="preserve">Sources : ANESM — Les attentes de la personne et le projet personnalisé (décembre 2008) · ANESM — Synthèse opérationnelle (2012) · HAS — Note de cadrage structuration PPA numérique (avril 2025) · Loi 2002-2 rénovant l’action sociale et médico-sociale</w:t>
+        <w:t xml:space="preserve">Sources : ANESM — Les attentes de la personne et le projet personnalisé (décembre 2008), </w:t>
+      </w:r>
+      <w:hyperlink w:history="1" r:id="rIdhas2835163">
+        <w:r>
+          <w:rPr>
+            <w:rFonts w:ascii="Calibri" w:cs="Calibri" w:eastAsia="Calibri" w:hAnsi="Calibri"/>
+            <w:i/>
+            <w:iCs/>
+            <w:sz w:val="18"/>
+            <w:szCs w:val="18"/>
+            <w:color w:val="1155CC"/>
+            <w:u w:val="single"/>
+          </w:rPr>
+          <w:t xml:space="preserve">has-sante.fr/jcms/c_2835163</w:t>
+        </w:r>
+      </w:hyperlink>
+      <w:r>
+        <w:rPr>
+          <w:rFonts w:ascii="Calibri" w:cs="Calibri" w:eastAsia="Calibri" w:hAnsi="Calibri"/>
+          <w:i/>
+          <w:iCs/>
+          <w:color w:val="6B7280"/>
+          <w:sz w:val="18"/>
+          <w:szCs w:val="18"/>
+        </w:rPr>
+        <w:t xml:space="preserve"> · ANESM — Synthèse opérationnelle (2012, même page) · HAS — Note de cadrage structuration PPA numérique (validée le 6 mai 2025, publiée le 12 mai 2025), </w:t>
+      </w:r>
+      <w:hyperlink w:history="1" r:id="rIdhas3604556">
+        <w:r>
+          <w:rPr>
+            <w:rFonts w:ascii="Calibri" w:cs="Calibri" w:eastAsia="Calibri" w:hAnsi="Calibri"/>
+            <w:i/>
+            <w:iCs/>
+            <w:sz w:val="18"/>
+            <w:szCs w:val="18"/>
+            <w:color w:val="1155CC"/>
+            <w:u w:val="single"/>
+          </w:rPr>
+          <w:t xml:space="preserve">has-sante.fr/jcms/p_3604556</w:t>
+        </w:r>
+      </w:hyperlink>
+      <w:r>
+        <w:rPr>
+          <w:rFonts w:ascii="Calibri" w:cs="Calibri" w:eastAsia="Calibri" w:hAnsi="Calibri"/>
+          <w:i/>
+          <w:iCs/>
+          <w:color w:val="6B7280"/>
+          <w:sz w:val="18"/>
+          <w:szCs w:val="18"/>
+        </w:rPr>
+        <w:t xml:space="preserve"> · Loi 2002-2 rénovant l’action sociale et médico-sociale</w:t>
+      </w:r>
+    </w:p>
+    <w:p>
+      <w:pPr>
+        <w:spacing w:after="120" w:before="320"/>
+      </w:pPr>
+      <w:r>
+        <w:rPr>
+          <w:rFonts w:ascii="Calibri" w:cs="Calibri" w:eastAsia="Calibri" w:hAnsi="Calibri"/>
+          <w:b/>
+          <w:bCs/>
+          <w:color w:val="1B3A6B"/>
+          <w:sz w:val="28"/>
+          <w:szCs w:val="28"/>
+        </w:rPr>
+        <w:t xml:space="preserve">📝 Journal des corrections — 12 septembre 2026</w:t>
+      </w:r>
+    </w:p>
+    <w:p>
+      <w:pPr>
+        <w:spacing w:after="80"/>
+      </w:pPr>
+      <w:r>
+        <w:rPr>
+          <w:rFonts w:ascii="Calibri" w:cs="Calibri" w:eastAsia="Calibri" w:hAnsi="Calibri"/>
+          <w:color w:val="1F2937"/>
+          <w:sz w:val="22"/>
+          <w:szCs w:val="22"/>
+        </w:rPr>
+        <w:t xml:space="preserve">Note relue le 12/09/2026 au cours d'un contrôle d'attribution des 221 documents du dépôt (passes A2 et A4 : une norme nommée, une ligne « Source : », portent une adresse). Contenu inchangé.</w:t>
+      </w:r>
+    </w:p>
+    <w:p>
+      <w:pPr>
+        <w:spacing w:after="80"/>
+      </w:pPr>
+      <w:r>
+        <w:rPr>
+          <w:rFonts w:ascii="Calibri" w:cs="Calibri" w:eastAsia="Calibri" w:hAnsi="Calibri"/>
+          <w:color w:val="1F2937"/>
+          <w:sz w:val="22"/>
+          <w:szCs w:val="22"/>
+        </w:rPr>
+        <w:t xml:space="preserve">La ligne « Sources : ANESM — … · HAS — Note de cadrage … (avril 2025) » nommait quatre références sans aucune adresse dans le document. Les deux pages HAS sont liées le 12/09/2026 : la recommandation ANESM de 2008 (page mise à jour le 16/03/2018, qui porte aussi la synthèse) et la note de cadrage PPA numérique — dont la date est précisée au passage : validée le 6 mai 2025, publiée le 12 mai 2025, non « avril 2025 » (lu sur la page le 12/09/2026). La loi 2002-2 reste nommée sans lien : c'est un texte, pas une page consultée.</w:t>
       </w:r>
     </w:p>
     <w:sectPr>

</xml_diff>